<commit_message>
Entrega 2: lectura sin jerga en el cuaderno; informe re-guardado desde Word
Co-Authored-By: Claude Fable 5.1 <noreply@anthropic.com>
</commit_message>
<xml_diff>
--- a/entregas/Entrega2_RAFFO.docx
+++ b/entregas/Entrega2_RAFFO.docx
@@ -208,7 +208,10 @@
         <w:jc w:val="center"/>
       </w:pPr>
       <w:r>
-        <w:t>Raffo Romero, Giovanni Antonio</w:t>
+        <w:t>Raffo Romero, Giovanni Antoni</w:t>
+      </w:r>
+      <w:r>
+        <w:t>o</w:t>
       </w:r>
     </w:p>
     <w:p>
@@ -249,6 +252,7 @@
           <w:sz w:val="28"/>
           <w:szCs w:val="28"/>
         </w:rPr>
+        <w:lastRenderedPageBreak/>
         <w:t>RESUMEN EJECUTIVO</w:t>
       </w:r>
     </w:p>
@@ -297,6 +301,7 @@
           <w:sz w:val="28"/>
           <w:szCs w:val="28"/>
         </w:rPr>
+        <w:lastRenderedPageBreak/>
         <w:t>ÍNDICE</w:t>
       </w:r>
     </w:p>
@@ -305,7 +310,6 @@
         <w:alias w:val="Índice"/>
         <w:id w:val="-785961968"/>
       </w:sdtPr>
-      <w:sdtEndPr/>
       <w:sdtContent>
         <w:p>
           <w:pPr>
@@ -1192,6 +1196,7 @@
       </w:pPr>
       <w:bookmarkStart w:id="0" w:name="_Toc240460058"/>
       <w:r>
+        <w:lastRenderedPageBreak/>
         <w:t>1. INTRODUCCIÓN</w:t>
       </w:r>
       <w:bookmarkEnd w:id="0"/>
@@ -1239,10 +1244,7 @@
         <w:jc w:val="both"/>
       </w:pPr>
       <w:r>
-        <w:t>Se eligió la regresión logística con pesos de clase (class_weight = "balanced"). Es el modelo más simple que entrega, para cada empleado, una probabilidad de renuncia, y para cada variable un peso que Recursos Humanos puede leer directamente: cuánto suma hacer horas extra, cuánto resta la antigüedad. Con 1.470 empleados y 48 columnas, un modelo lineal regularizado tiene menos varianza que un ensamble y generaliza mejor. Los pesos de clase aplican la decisión de balance tomada en la Entrega 1: una renuncia m</w:t>
-      </w:r>
-      <w:r>
-        <w:t>al predicha pesa unas cinco veces más que un error sobre quien se queda, sin generar datos sintéticos.</w:t>
+        <w:t>Se eligió la regresión logística con pesos de clase (class_weight = "balanced"). Es el modelo más simple que entrega, para cada empleado, una probabilidad de renuncia, y para cada variable un peso que Recursos Humanos puede leer directamente: cuánto suma hacer horas extra, cuánto resta la antigüedad. Con 1.470 empleados y 48 columnas, un modelo lineal regularizado tiene menos varianza que un ensamble y generaliza mejor. Los pesos de clase aplican la decisión de balance tomada en la Entrega 1: una renuncia mal predicha pesa unas cinco veces más que un error sobre quien se queda, sin generar datos sintéticos.</w:t>
       </w:r>
     </w:p>
     <w:p>
@@ -1313,6 +1315,7 @@
           <w:b/>
           <w:bCs/>
         </w:rPr>
+        <w:lastRenderedPageBreak/>
         <w:t>Tabla 1: Métricas del modelo sin ajustar (validación cruzada, 5 particiones)</w:t>
       </w:r>
     </w:p>
@@ -1340,12 +1343,6 @@
         <w:gridCol w:w="4126"/>
       </w:tblGrid>
       <w:tr>
-        <w:tblPrEx>
-          <w:tblCellMar>
-            <w:top w:w="0" w:type="dxa"/>
-            <w:bottom w:w="0" w:type="dxa"/>
-          </w:tblCellMar>
-        </w:tblPrEx>
         <w:trPr>
           <w:tblHeader/>
         </w:trPr>
@@ -1443,12 +1440,6 @@
         </w:tc>
       </w:tr>
       <w:tr>
-        <w:tblPrEx>
-          <w:tblCellMar>
-            <w:top w:w="0" w:type="dxa"/>
-            <w:bottom w:w="0" w:type="dxa"/>
-          </w:tblCellMar>
-        </w:tblPrEx>
         <w:tc>
           <w:tcPr>
             <w:tcW w:w="1600" w:type="dxa"/>
@@ -1531,12 +1522,6 @@
         </w:tc>
       </w:tr>
       <w:tr>
-        <w:tblPrEx>
-          <w:tblCellMar>
-            <w:top w:w="0" w:type="dxa"/>
-            <w:bottom w:w="0" w:type="dxa"/>
-          </w:tblCellMar>
-        </w:tblPrEx>
         <w:tc>
           <w:tcPr>
             <w:tcW w:w="1600" w:type="dxa"/>
@@ -1619,12 +1604,6 @@
         </w:tc>
       </w:tr>
       <w:tr>
-        <w:tblPrEx>
-          <w:tblCellMar>
-            <w:top w:w="0" w:type="dxa"/>
-            <w:bottom w:w="0" w:type="dxa"/>
-          </w:tblCellMar>
-        </w:tblPrEx>
         <w:tc>
           <w:tcPr>
             <w:tcW w:w="1600" w:type="dxa"/>
@@ -1707,12 +1686,6 @@
         </w:tc>
       </w:tr>
       <w:tr>
-        <w:tblPrEx>
-          <w:tblCellMar>
-            <w:top w:w="0" w:type="dxa"/>
-            <w:bottom w:w="0" w:type="dxa"/>
-          </w:tblCellMar>
-        </w:tblPrEx>
         <w:tc>
           <w:tcPr>
             <w:tcW w:w="1600" w:type="dxa"/>
@@ -1795,12 +1768,6 @@
         </w:tc>
       </w:tr>
       <w:tr>
-        <w:tblPrEx>
-          <w:tblCellMar>
-            <w:top w:w="0" w:type="dxa"/>
-            <w:bottom w:w="0" w:type="dxa"/>
-          </w:tblCellMar>
-        </w:tblPrEx>
         <w:tc>
           <w:tcPr>
             <w:tcW w:w="1600" w:type="dxa"/>
@@ -1955,12 +1922,6 @@
         <w:gridCol w:w="3126"/>
       </w:tblGrid>
       <w:tr>
-        <w:tblPrEx>
-          <w:tblCellMar>
-            <w:top w:w="0" w:type="dxa"/>
-            <w:bottom w:w="0" w:type="dxa"/>
-          </w:tblCellMar>
-        </w:tblPrEx>
         <w:trPr>
           <w:tblHeader/>
         </w:trPr>
@@ -2058,12 +2019,6 @@
         </w:tc>
       </w:tr>
       <w:tr>
-        <w:tblPrEx>
-          <w:tblCellMar>
-            <w:top w:w="0" w:type="dxa"/>
-            <w:bottom w:w="0" w:type="dxa"/>
-          </w:tblCellMar>
-        </w:tblPrEx>
         <w:tc>
           <w:tcPr>
             <w:tcW w:w="1500" w:type="dxa"/>
@@ -2146,12 +2101,6 @@
         </w:tc>
       </w:tr>
       <w:tr>
-        <w:tblPrEx>
-          <w:tblCellMar>
-            <w:top w:w="0" w:type="dxa"/>
-            <w:bottom w:w="0" w:type="dxa"/>
-          </w:tblCellMar>
-        </w:tblPrEx>
         <w:tc>
           <w:tcPr>
             <w:tcW w:w="1500" w:type="dxa"/>
@@ -2234,12 +2183,6 @@
         </w:tc>
       </w:tr>
       <w:tr>
-        <w:tblPrEx>
-          <w:tblCellMar>
-            <w:top w:w="0" w:type="dxa"/>
-            <w:bottom w:w="0" w:type="dxa"/>
-          </w:tblCellMar>
-        </w:tblPrEx>
         <w:tc>
           <w:tcPr>
             <w:tcW w:w="1500" w:type="dxa"/>
@@ -2322,12 +2265,6 @@
         </w:tc>
       </w:tr>
       <w:tr>
-        <w:tblPrEx>
-          <w:tblCellMar>
-            <w:top w:w="0" w:type="dxa"/>
-            <w:bottom w:w="0" w:type="dxa"/>
-          </w:tblCellMar>
-        </w:tblPrEx>
         <w:tc>
           <w:tcPr>
             <w:tcW w:w="1500" w:type="dxa"/>
@@ -2410,12 +2347,6 @@
         </w:tc>
       </w:tr>
       <w:tr>
-        <w:tblPrEx>
-          <w:tblCellMar>
-            <w:top w:w="0" w:type="dxa"/>
-            <w:bottom w:w="0" w:type="dxa"/>
-          </w:tblCellMar>
-        </w:tblPrEx>
         <w:tc>
           <w:tcPr>
             <w:tcW w:w="1500" w:type="dxa"/>
@@ -2561,6 +2492,7 @@
           <w:b/>
           <w:bCs/>
         </w:rPr>
+        <w:lastRenderedPageBreak/>
         <w:t>Gráfico 1: Recall, precisión y proporción de empleados marcados según el punto de corte</w:t>
       </w:r>
     </w:p>
@@ -2666,12 +2598,6 @@
         <w:gridCol w:w="3626"/>
       </w:tblGrid>
       <w:tr>
-        <w:tblPrEx>
-          <w:tblCellMar>
-            <w:top w:w="0" w:type="dxa"/>
-            <w:bottom w:w="0" w:type="dxa"/>
-          </w:tblCellMar>
-        </w:tblPrEx>
         <w:trPr>
           <w:tblHeader/>
         </w:trPr>
@@ -2769,12 +2695,6 @@
         </w:tc>
       </w:tr>
       <w:tr>
-        <w:tblPrEx>
-          <w:tblCellMar>
-            <w:top w:w="0" w:type="dxa"/>
-            <w:bottom w:w="0" w:type="dxa"/>
-          </w:tblCellMar>
-        </w:tblPrEx>
         <w:tc>
           <w:tcPr>
             <w:tcW w:w="1800" w:type="dxa"/>
@@ -2857,12 +2777,6 @@
         </w:tc>
       </w:tr>
       <w:tr>
-        <w:tblPrEx>
-          <w:tblCellMar>
-            <w:top w:w="0" w:type="dxa"/>
-            <w:bottom w:w="0" w:type="dxa"/>
-          </w:tblCellMar>
-        </w:tblPrEx>
         <w:tc>
           <w:tcPr>
             <w:tcW w:w="1800" w:type="dxa"/>
@@ -2945,12 +2859,6 @@
         </w:tc>
       </w:tr>
       <w:tr>
-        <w:tblPrEx>
-          <w:tblCellMar>
-            <w:top w:w="0" w:type="dxa"/>
-            <w:bottom w:w="0" w:type="dxa"/>
-          </w:tblCellMar>
-        </w:tblPrEx>
         <w:tc>
           <w:tcPr>
             <w:tcW w:w="1800" w:type="dxa"/>
@@ -3033,12 +2941,6 @@
         </w:tc>
       </w:tr>
       <w:tr>
-        <w:tblPrEx>
-          <w:tblCellMar>
-            <w:top w:w="0" w:type="dxa"/>
-            <w:bottom w:w="0" w:type="dxa"/>
-          </w:tblCellMar>
-        </w:tblPrEx>
         <w:tc>
           <w:tcPr>
             <w:tcW w:w="1800" w:type="dxa"/>
@@ -3121,12 +3023,6 @@
         </w:tc>
       </w:tr>
       <w:tr>
-        <w:tblPrEx>
-          <w:tblCellMar>
-            <w:top w:w="0" w:type="dxa"/>
-            <w:bottom w:w="0" w:type="dxa"/>
-          </w:tblCellMar>
-        </w:tblPrEx>
         <w:tc>
           <w:tcPr>
             <w:tcW w:w="1800" w:type="dxa"/>
@@ -3209,12 +3105,6 @@
         </w:tc>
       </w:tr>
       <w:tr>
-        <w:tblPrEx>
-          <w:tblCellMar>
-            <w:top w:w="0" w:type="dxa"/>
-            <w:bottom w:w="0" w:type="dxa"/>
-          </w:tblCellMar>
-        </w:tblPrEx>
         <w:tc>
           <w:tcPr>
             <w:tcW w:w="1800" w:type="dxa"/>
@@ -3297,12 +3187,6 @@
         </w:tc>
       </w:tr>
       <w:tr>
-        <w:tblPrEx>
-          <w:tblCellMar>
-            <w:top w:w="0" w:type="dxa"/>
-            <w:bottom w:w="0" w:type="dxa"/>
-          </w:tblCellMar>
-        </w:tblPrEx>
         <w:tc>
           <w:tcPr>
             <w:tcW w:w="1800" w:type="dxa"/>
@@ -3439,6 +3323,7 @@
           <w:b/>
           <w:bCs/>
         </w:rPr>
+        <w:lastRenderedPageBreak/>
         <w:t>Tabla 4: Métricas en el grupo de examen (294 empleados, 47 renuncias)</w:t>
       </w:r>
     </w:p>
@@ -3466,12 +3351,6 @@
         <w:gridCol w:w="4126"/>
       </w:tblGrid>
       <w:tr>
-        <w:tblPrEx>
-          <w:tblCellMar>
-            <w:top w:w="0" w:type="dxa"/>
-            <w:bottom w:w="0" w:type="dxa"/>
-          </w:tblCellMar>
-        </w:tblPrEx>
         <w:trPr>
           <w:tblHeader/>
         </w:trPr>
@@ -3569,12 +3448,6 @@
         </w:tc>
       </w:tr>
       <w:tr>
-        <w:tblPrEx>
-          <w:tblCellMar>
-            <w:top w:w="0" w:type="dxa"/>
-            <w:bottom w:w="0" w:type="dxa"/>
-          </w:tblCellMar>
-        </w:tblPrEx>
         <w:tc>
           <w:tcPr>
             <w:tcW w:w="1600" w:type="dxa"/>
@@ -3657,12 +3530,6 @@
         </w:tc>
       </w:tr>
       <w:tr>
-        <w:tblPrEx>
-          <w:tblCellMar>
-            <w:top w:w="0" w:type="dxa"/>
-            <w:bottom w:w="0" w:type="dxa"/>
-          </w:tblCellMar>
-        </w:tblPrEx>
         <w:tc>
           <w:tcPr>
             <w:tcW w:w="1600" w:type="dxa"/>
@@ -3745,12 +3612,6 @@
         </w:tc>
       </w:tr>
       <w:tr>
-        <w:tblPrEx>
-          <w:tblCellMar>
-            <w:top w:w="0" w:type="dxa"/>
-            <w:bottom w:w="0" w:type="dxa"/>
-          </w:tblCellMar>
-        </w:tblPrEx>
         <w:tc>
           <w:tcPr>
             <w:tcW w:w="1600" w:type="dxa"/>
@@ -3833,12 +3694,6 @@
         </w:tc>
       </w:tr>
       <w:tr>
-        <w:tblPrEx>
-          <w:tblCellMar>
-            <w:top w:w="0" w:type="dxa"/>
-            <w:bottom w:w="0" w:type="dxa"/>
-          </w:tblCellMar>
-        </w:tblPrEx>
         <w:tc>
           <w:tcPr>
             <w:tcW w:w="1600" w:type="dxa"/>
@@ -3921,12 +3776,6 @@
         </w:tc>
       </w:tr>
       <w:tr>
-        <w:tblPrEx>
-          <w:tblCellMar>
-            <w:top w:w="0" w:type="dxa"/>
-            <w:bottom w:w="0" w:type="dxa"/>
-          </w:tblCellMar>
-        </w:tblPrEx>
         <w:tc>
           <w:tcPr>
             <w:tcW w:w="1600" w:type="dxa"/>
@@ -4180,6 +4029,7 @@
           <w:b/>
           <w:bCs/>
         </w:rPr>
+        <w:lastRenderedPageBreak/>
         <w:t>Gráfico 3: Los 15 factores de mayor peso en el modelo</w:t>
       </w:r>
     </w:p>
@@ -4320,7 +4170,11 @@
         <w:jc w:val="both"/>
       </w:pPr>
       <w:r>
-        <w:t>Como prueba, el cuaderno recarga el archivo desde cero y le pasa los datos crudos de un empleado del grupo de examen que efectivamente renunció: 36 años, científico de investigación, con horas extra, ingreso mensual de 3.388 USD y dos años de carrera. El modelo devuelve una probabilidad de renuncia de 0,66, por encima del corte de 0,40, y lo marca como riesgo. Si esto funciona en el cuaderno, funciona en la API.</w:t>
+        <w:t xml:space="preserve">Como prueba, el cuaderno recarga el archivo desde cero y le pasa los datos crudos de un empleado del grupo de examen que efectivamente renunció: 36 años, científico de investigación, con horas extra, ingreso mensual de 3.388 USD y dos años de carrera. El modelo devuelve una probabilidad de </w:t>
+      </w:r>
+      <w:r>
+        <w:lastRenderedPageBreak/>
+        <w:t>renuncia de 0,66, por encima del corte de 0,40, y lo marca como riesgo. Si esto funciona en el cuaderno, funciona en la API.</w:t>
       </w:r>
     </w:p>
     <w:p>
@@ -4378,12 +4232,6 @@
         <w:gridCol w:w="6026"/>
       </w:tblGrid>
       <w:tr>
-        <w:tblPrEx>
-          <w:tblCellMar>
-            <w:top w:w="0" w:type="dxa"/>
-            <w:bottom w:w="0" w:type="dxa"/>
-          </w:tblCellMar>
-        </w:tblPrEx>
         <w:trPr>
           <w:tblHeader/>
         </w:trPr>
@@ -4435,12 +4283,6 @@
         </w:tc>
       </w:tr>
       <w:tr>
-        <w:tblPrEx>
-          <w:tblCellMar>
-            <w:top w:w="0" w:type="dxa"/>
-            <w:bottom w:w="0" w:type="dxa"/>
-          </w:tblCellMar>
-        </w:tblPrEx>
         <w:tc>
           <w:tcPr>
             <w:tcW w:w="3000" w:type="dxa"/>
@@ -4483,12 +4325,6 @@
         </w:tc>
       </w:tr>
       <w:tr>
-        <w:tblPrEx>
-          <w:tblCellMar>
-            <w:top w:w="0" w:type="dxa"/>
-            <w:bottom w:w="0" w:type="dxa"/>
-          </w:tblCellMar>
-        </w:tblPrEx>
         <w:tc>
           <w:tcPr>
             <w:tcW w:w="3000" w:type="dxa"/>
@@ -4531,12 +4367,6 @@
         </w:tc>
       </w:tr>
       <w:tr>
-        <w:tblPrEx>
-          <w:tblCellMar>
-            <w:top w:w="0" w:type="dxa"/>
-            <w:bottom w:w="0" w:type="dxa"/>
-          </w:tblCellMar>
-        </w:tblPrEx>
         <w:tc>
           <w:tcPr>
             <w:tcW w:w="3000" w:type="dxa"/>
@@ -4579,12 +4409,6 @@
         </w:tc>
       </w:tr>
       <w:tr>
-        <w:tblPrEx>
-          <w:tblCellMar>
-            <w:top w:w="0" w:type="dxa"/>
-            <w:bottom w:w="0" w:type="dxa"/>
-          </w:tblCellMar>
-        </w:tblPrEx>
         <w:tc>
           <w:tcPr>
             <w:tcW w:w="3000" w:type="dxa"/>
@@ -4627,12 +4451,6 @@
         </w:tc>
       </w:tr>
       <w:tr>
-        <w:tblPrEx>
-          <w:tblCellMar>
-            <w:top w:w="0" w:type="dxa"/>
-            <w:bottom w:w="0" w:type="dxa"/>
-          </w:tblCellMar>
-        </w:tblPrEx>
         <w:tc>
           <w:tcPr>
             <w:tcW w:w="3000" w:type="dxa"/>
@@ -4675,12 +4493,6 @@
         </w:tc>
       </w:tr>
       <w:tr>
-        <w:tblPrEx>
-          <w:tblCellMar>
-            <w:top w:w="0" w:type="dxa"/>
-            <w:bottom w:w="0" w:type="dxa"/>
-          </w:tblCellMar>
-        </w:tblPrEx>
         <w:tc>
           <w:tcPr>
             <w:tcW w:w="3000" w:type="dxa"/>

</xml_diff>